<commit_message>
JAGI manuscript draft 2: review fixes
</commit_message>
<xml_diff>
--- a/docs/manuscript_jagi/jagi_reference.docx
+++ b/docs/manuscript_jagi/jagi_reference.docx
@@ -2649,7 +2649,7 @@
             <w:jc w:val="right"/>
           </w:pPr>
           <w:r>
-            <w:t xml:space="preserve">Submitted 2026-10-24</w:t>
+            <w:t xml:space="preserve">Submitted yyyy-mm-dd</w:t>
           </w:r>
         </w:p>
         <w:p>
@@ -3828,6 +3828,7 @@
     <w:basedOn w:val="Normal"/>
     <w:qFormat/>
     <w:pPr>
+      <w:keepNext/>
       <w:spacing w:before="0" w:after="0"/>
     </w:pPr>
     <w:rPr>
@@ -3839,6 +3840,7 @@
     <w:name w:val="Image Caption"/>
     <w:basedOn w:val="Normal"/>
     <w:pPr>
+      <w:keepLines/>
       <w:spacing w:before="120" w:after="240"/>
       <w:jc w:val="both"/>
     </w:pPr>
@@ -3851,6 +3853,7 @@
     <w:name w:val="Table Caption"/>
     <w:basedOn w:val="Normal"/>
     <w:pPr>
+      <w:keepLines/>
       <w:spacing w:before="120" w:after="240"/>
       <w:jc w:val="both"/>
     </w:pPr>

</xml_diff>